<commit_message>
course: appendix A — reading the plots (five-check habit, sim to real flight)
One-page checklist anchored to demo_hover's real numbers: reference vs
actual, damping/overshoot, settle time vs pole-placement prediction,
actuator saturation, steady-state physics audit; cross-table for the
trajectory/swarm demos and analyze_log.py real-flight panels. Indexed in
the course README and included in the regenerated workbook.

Co-Authored-By: Claude Fable 5 <noreply@anthropic.com>
</commit_message>
<xml_diff>
--- a/docs/course/Quadrotor_Course.docx
+++ b/docs/course/Quadrotor_Course.docx
@@ -74721,6 +74721,882 @@
     </w:p>
     <w:bookmarkEnd w:id="162"/>
     <w:bookmarkEnd w:id="163"/>
+    <w:bookmarkStart w:id="166" w:name="Xe87dd2e0b3b15e5b2dd8f34c744eda6a6f96a96"/>
+    <w:p>
+      <w:pPr>
+        <w:pStyle w:val="Heading1"/>
+      </w:pPr>
+      <w:r>
+        <w:t xml:space="preserve">Appendix A — Reading the plots: five checks for every flight</w:t>
+      </w:r>
+    </w:p>
+    <w:p>
+      <w:pPr>
+        <w:pStyle w:val="FirstParagraph"/>
+      </w:pPr>
+      <w:r>
+        <w:t xml:space="preserve">Every demo in this repo ends in the same four-panel figure (</w:t>
+      </w:r>
+      <w:r>
+        <w:rPr>
+          <w:rStyle w:val="VerbatimChar"/>
+        </w:rPr>
+        <w:t xml:space="preserve">quadsim/viz.py</w:t>
+      </w:r>
+      <w:r>
+        <w:t xml:space="preserve">’s</w:t>
+      </w:r>
+      <w:r>
+        <w:t xml:space="preserve"> </w:t>
+      </w:r>
+      <w:r>
+        <w:rPr>
+          <w:rStyle w:val="VerbatimChar"/>
+        </w:rPr>
+        <w:t xml:space="preserve">plot_tracking</w:t>
+      </w:r>
+      <w:r>
+        <w:t xml:space="preserve">), and every</w:t>
+      </w:r>
+      <w:r>
+        <w:t xml:space="preserve"> </w:t>
+      </w:r>
+      <w:r>
+        <w:rPr>
+          <w:iCs/>
+          <w:i/>
+        </w:rPr>
+        <w:t xml:space="preserve">real</w:t>
+      </w:r>
+      <w:r>
+        <w:t xml:space="preserve"> </w:t>
+      </w:r>
+      <w:r>
+        <w:t xml:space="preserve">flight in the test campaign will end in the same</w:t>
+      </w:r>
+      <w:r>
+        <w:t xml:space="preserve"> </w:t>
+      </w:r>
+      <w:r>
+        <w:t xml:space="preserve">panels drawn from a log (</w:t>
+      </w:r>
+      <w:r>
+        <w:rPr>
+          <w:rStyle w:val="VerbatimChar"/>
+        </w:rPr>
+        <w:t xml:space="preserve">flight/analyze_log.py --plot</w:t>
+      </w:r>
+      <w:r>
+        <w:t xml:space="preserve">). That is deliberate: reading</w:t>
+      </w:r>
+      <w:r>
+        <w:t xml:space="preserve"> </w:t>
+      </w:r>
+      <w:r>
+        <w:t xml:space="preserve">this figure is a skill you use from your first simulation to your last flight test.</w:t>
+      </w:r>
+      <w:r>
+        <w:t xml:space="preserve"> </w:t>
+      </w:r>
+      <w:r>
+        <w:t xml:space="preserve">This page is the checklist. Run</w:t>
+      </w:r>
+      <w:r>
+        <w:t xml:space="preserve"> </w:t>
+      </w:r>
+      <w:r>
+        <w:rPr>
+          <w:rStyle w:val="VerbatimChar"/>
+        </w:rPr>
+        <w:t xml:space="preserve">.venv/bin/python demos/demo_hover.py --fast</w:t>
+      </w:r>
+      <w:r>
+        <w:t xml:space="preserve"> </w:t>
+      </w:r>
+      <w:r>
+        <w:t xml:space="preserve">and open</w:t>
+      </w:r>
+      <w:r>
+        <w:t xml:space="preserve"> </w:t>
+      </w:r>
+      <w:r>
+        <w:rPr>
+          <w:rStyle w:val="VerbatimChar"/>
+        </w:rPr>
+        <w:t xml:space="preserve">out/hover_tracking.png</w:t>
+      </w:r>
+      <w:r>
+        <w:t xml:space="preserve"> </w:t>
+      </w:r>
+      <w:r>
+        <w:t xml:space="preserve">to follow along with real numbers.</w:t>
+      </w:r>
+    </w:p>
+    <w:p>
+      <w:pPr>
+        <w:pStyle w:val="BodyText"/>
+      </w:pPr>
+      <w:r>
+        <w:t xml:space="preserve">The four panels, top-left to bottom-right:</w:t>
+      </w:r>
+      <w:r>
+        <w:t xml:space="preserve"> </w:t>
+      </w:r>
+      <w:r>
+        <w:rPr>
+          <w:bCs/>
+          <w:b/>
+        </w:rPr>
+        <w:t xml:space="preserve">position</w:t>
+      </w:r>
+      <w:r>
+        <w:t xml:space="preserve"> </w:t>
+      </w:r>
+      <w:r>
+        <w:t xml:space="preserve">(solid = actual, dashed =</w:t>
+      </w:r>
+      <w:r>
+        <w:t xml:space="preserve"> </w:t>
+      </w:r>
+      <w:r>
+        <w:t xml:space="preserve">reference),</w:t>
+      </w:r>
+      <w:r>
+        <w:t xml:space="preserve"> </w:t>
+      </w:r>
+      <w:r>
+        <w:rPr>
+          <w:bCs/>
+          <w:b/>
+        </w:rPr>
+        <w:t xml:space="preserve">position error norm</w:t>
+      </w:r>
+      <w:r>
+        <w:t xml:space="preserve"> </w:t>
+      </w:r>
+      <w:r>
+        <w:t xml:space="preserve">(one scalar: distance to the reference),</w:t>
+      </w:r>
+      <w:r>
+        <w:t xml:space="preserve"> </w:t>
+      </w:r>
+      <w:r>
+        <w:rPr>
+          <w:bCs/>
+          <w:b/>
+        </w:rPr>
+        <w:t xml:space="preserve">total thrust</w:t>
+      </w:r>
+      <w:r>
+        <w:t xml:space="preserve"> </w:t>
+      </w:r>
+      <w:r>
+        <w:t xml:space="preserve">(the effort, with the</w:t>
+      </w:r>
+      <w:r>
+        <w:t xml:space="preserve"> </w:t>
+      </w:r>
+      <w:r>
+        <w:rPr>
+          <w:rStyle w:val="VerbatimChar"/>
+        </w:rPr>
+        <w:t xml:space="preserve">f_max</w:t>
+      </w:r>
+      <w:r>
+        <w:t xml:space="preserve"> </w:t>
+      </w:r>
+      <w:r>
+        <w:t xml:space="preserve">limit dashed red), and</w:t>
+      </w:r>
+      <w:r>
+        <w:t xml:space="preserve"> </w:t>
+      </w:r>
+      <w:r>
+        <w:rPr>
+          <w:bCs/>
+          <w:b/>
+        </w:rPr>
+        <w:t xml:space="preserve">body rates</w:t>
+      </w:r>
+      <w:r>
+        <w:t xml:space="preserve"> </w:t>
+      </w:r>
+      <w:r>
+        <w:t xml:space="preserve">(the attitude loop’s activity).</w:t>
+      </w:r>
+    </w:p>
+    <w:bookmarkStart w:id="164" w:name="the-five-checks"/>
+    <w:p>
+      <w:pPr>
+        <w:pStyle w:val="Heading2"/>
+      </w:pPr>
+      <w:r>
+        <w:t xml:space="preserve">The five checks</w:t>
+      </w:r>
+    </w:p>
+    <w:p>
+      <w:pPr>
+        <w:pStyle w:val="FirstParagraph"/>
+      </w:pPr>
+      <w:r>
+        <w:rPr>
+          <w:bCs/>
+          <w:b/>
+        </w:rPr>
+        <w:t xml:space="preserve">1. Find reference vs actual — their gap is the whole story.</w:t>
+      </w:r>
+      <w:r>
+        <w:t xml:space="preserve"> </w:t>
+      </w:r>
+      <w:r>
+        <w:t xml:space="preserve">Dashed is where the vehicle should be; solid is where it is. Everything else on the</w:t>
+      </w:r>
+      <w:r>
+        <w:t xml:space="preserve"> </w:t>
+      </w:r>
+      <w:r>
+        <w:t xml:space="preserve">page explains the gap between them. Hover demo: the gap starts at 0.40 m</w:t>
+      </w:r>
+      <w:r>
+        <w:t xml:space="preserve"> </w:t>
+      </w:r>
+      <w:r>
+        <w:t xml:space="preserve">(= √(0.23² + 0.23² + 0.23²), the three initial offsets combined) and ends below a</w:t>
+      </w:r>
+      <w:r>
+        <w:t xml:space="preserve"> </w:t>
+      </w:r>
+      <w:r>
+        <w:t xml:space="preserve">millimeter. In a real-flight plot the</w:t>
+      </w:r>
+      <w:r>
+        <w:t xml:space="preserve"> </w:t>
+      </w:r>
+      <w:r>
+        <w:t xml:space="preserve">“</w:t>
+      </w:r>
+      <w:r>
+        <w:t xml:space="preserve">actual</w:t>
+      </w:r>
+      <w:r>
+        <w:t xml:space="preserve">”</w:t>
+      </w:r>
+      <w:r>
+        <w:t xml:space="preserve"> </w:t>
+      </w:r>
+      <w:r>
+        <w:t xml:space="preserve">line is itself an</w:t>
+      </w:r>
+      <w:r>
+        <w:t xml:space="preserve"> </w:t>
+      </w:r>
+      <w:r>
+        <w:rPr>
+          <w:iCs/>
+          <w:i/>
+        </w:rPr>
+        <w:t xml:space="preserve">estimate</w:t>
+      </w:r>
+      <w:r>
+        <w:t xml:space="preserve"> </w:t>
+      </w:r>
+      <w:r>
+        <w:t xml:space="preserve">— keep</w:t>
+      </w:r>
+      <w:r>
+        <w:t xml:space="preserve"> </w:t>
+      </w:r>
+      <w:r>
+        <w:t xml:space="preserve">ch07’s grain of salt.</w:t>
+      </w:r>
+    </w:p>
+    <w:p>
+      <w:pPr>
+        <w:pStyle w:val="BodyText"/>
+      </w:pPr>
+      <w:r>
+        <w:rPr>
+          <w:bCs/>
+          <w:b/>
+        </w:rPr>
+        <w:t xml:space="preserve">2. Overshoot and ringing — read the damping.</w:t>
+      </w:r>
+      <w:r>
+        <w:t xml:space="preserve"> </w:t>
+      </w:r>
+      <w:r>
+        <w:t xml:space="preserve">Does the solid line cross the dashed one and come back? That is overshoot:</w:t>
+      </w:r>
+      <w:r>
+        <w:t xml:space="preserve"> </w:t>
+      </w:r>
+      <w:r>
+        <w:t xml:space="preserve">underdamping. Does the error oscillate as it decays? Ringing. Our default gains place</w:t>
+      </w:r>
+      <w:r>
+        <w:t xml:space="preserve"> </w:t>
+      </w:r>
+      <w:r>
+        <w:t xml:space="preserve">both loops at critical damping (ζ = 1, ch03), so healthy plots show</w:t>
+      </w:r>
+      <w:r>
+        <w:t xml:space="preserve"> </w:t>
+      </w:r>
+      <w:r>
+        <w:rPr>
+          <w:bCs/>
+          <w:b/>
+        </w:rPr>
+        <w:t xml:space="preserve">monotone</w:t>
+      </w:r>
+      <w:r>
+        <w:t xml:space="preserve"> </w:t>
+      </w:r>
+      <w:r>
+        <w:t xml:space="preserve">convergence — no crossing, no ripple. A brief, sharp spike in</w:t>
+      </w:r>
+      <w:r>
+        <w:t xml:space="preserve"> </w:t>
+      </w:r>
+      <w:r>
+        <w:rPr>
+          <w:iCs/>
+          <w:i/>
+        </w:rPr>
+        <w:t xml:space="preserve">body rates</w:t>
+      </w:r>
+      <w:r>
+        <w:t xml:space="preserve"> </w:t>
+      </w:r>
+      <w:r>
+        <w:t xml:space="preserve">at the</w:t>
+      </w:r>
+      <w:r>
+        <w:t xml:space="preserve"> </w:t>
+      </w:r>
+      <w:r>
+        <w:t xml:space="preserve">start is normal (that’s the tilt that moves the vehicle, ~±5 rad/s in the hover</w:t>
+      </w:r>
+      <w:r>
+        <w:t xml:space="preserve"> </w:t>
+      </w:r>
+      <w:r>
+        <w:t xml:space="preserve">demo);</w:t>
+      </w:r>
+      <w:r>
+        <w:t xml:space="preserve"> </w:t>
+      </w:r>
+      <w:r>
+        <w:rPr>
+          <w:bCs/>
+          <w:b/>
+        </w:rPr>
+        <w:t xml:space="preserve">sustained oscillation</w:t>
+      </w:r>
+      <w:r>
+        <w:t xml:space="preserve"> </w:t>
+      </w:r>
+      <w:r>
+        <w:t xml:space="preserve">in body rates means the attitude loop is fighting</w:t>
+      </w:r>
+      <w:r>
+        <w:t xml:space="preserve"> </w:t>
+      </w:r>
+      <w:r>
+        <w:t xml:space="preserve">itself — ch03’s starve-kR experiment shows exactly that signature.</w:t>
+      </w:r>
+    </w:p>
+    <w:p>
+      <w:pPr>
+        <w:pStyle w:val="BodyText"/>
+      </w:pPr>
+      <w:r>
+        <w:rPr>
+          <w:bCs/>
+          <w:b/>
+        </w:rPr>
+        <w:t xml:space="preserve">3. Settle time vs prediction — the design audit.</w:t>
+      </w:r>
+      <w:r>
+        <w:t xml:space="preserve"> </w:t>
+      </w:r>
+      <w:r>
+        <w:t xml:space="preserve">Before looking, predict: a critically damped loop settles in roughly 4–6/ωₙ. Position</w:t>
+      </w:r>
+      <w:r>
+        <w:t xml:space="preserve"> </w:t>
+      </w:r>
+      <w:r>
+        <w:t xml:space="preserve">loop: ωₙ = √(kp/m) = √16 = 4 rad/s → predicted 1.0–1.5 s. Measured by the demo:</w:t>
+      </w:r>
+      <w:r>
+        <w:t xml:space="preserve"> </w:t>
+      </w:r>
+      <w:r>
+        <w:rPr>
+          <w:rStyle w:val="VerbatimChar"/>
+        </w:rPr>
+        <w:t xml:space="preserve">settle_time_s: 1.182</w:t>
+      </w:r>
+      <w:r>
+        <w:t xml:space="preserve">. If the measured value is far slower than predicted, something</w:t>
+      </w:r>
+      <w:r>
+        <w:t xml:space="preserve"> </w:t>
+      </w:r>
+      <w:r>
+        <w:t xml:space="preserve">is stealing authority — usually saturation (check 4) or a missing feedforward (ch03</w:t>
+      </w:r>
+      <w:r>
+        <w:t xml:space="preserve"> </w:t>
+      </w:r>
+      <w:r>
+        <w:t xml:space="preserve">Experiment 3).</w:t>
+      </w:r>
+    </w:p>
+    <w:p>
+      <w:pPr>
+        <w:pStyle w:val="BodyText"/>
+      </w:pPr>
+      <w:r>
+        <w:rPr>
+          <w:bCs/>
+          <w:b/>
+        </w:rPr>
+        <w:t xml:space="preserve">4. Actuator vs limits — hunt for saturation.</w:t>
+      </w:r>
+      <w:r>
+        <w:t xml:space="preserve"> </w:t>
+      </w:r>
+      <w:r>
+        <w:t xml:space="preserve">The thrust panel’s dashed red line is</w:t>
+      </w:r>
+      <w:r>
+        <w:t xml:space="preserve"> </w:t>
+      </w:r>
+      <w:r>
+        <w:rPr>
+          <w:rStyle w:val="VerbatimChar"/>
+        </w:rPr>
+        <w:t xml:space="preserve">f_max</w:t>
+      </w:r>
+      <w:r>
+        <w:t xml:space="preserve"> </w:t>
+      </w:r>
+      <w:r>
+        <w:t xml:space="preserve">= 4 × 0.16 = 0.64 N. The command</w:t>
+      </w:r>
+      <w:r>
+        <w:t xml:space="preserve"> </w:t>
+      </w:r>
+      <w:r>
+        <w:t xml:space="preserve">touching that line means the controller asked for more than the motors have; tracking</w:t>
+      </w:r>
+      <w:r>
+        <w:t xml:space="preserve"> </w:t>
+      </w:r>
+      <w:r>
+        <w:t xml:space="preserve">then degrades</w:t>
+      </w:r>
+      <w:r>
+        <w:t xml:space="preserve"> </w:t>
+      </w:r>
+      <w:r>
+        <w:rPr>
+          <w:iCs/>
+          <w:i/>
+        </w:rPr>
+        <w:t xml:space="preserve">silently</w:t>
+      </w:r>
+      <w:r>
+        <w:t xml:space="preserve"> </w:t>
+      </w:r>
+      <w:r>
+        <w:t xml:space="preserve">— no error message, just a growing gap in panel 1. The hover</w:t>
+      </w:r>
+      <w:r>
+        <w:t xml:space="preserve"> </w:t>
+      </w:r>
+      <w:r>
+        <w:t xml:space="preserve">demo cruises near half throttle (T/W ≈ 2, ch02); the aggressive figure-8 demo is</w:t>
+      </w:r>
+      <w:r>
+        <w:t xml:space="preserve"> </w:t>
+      </w:r>
+      <w:r>
+        <w:t xml:space="preserve">where this check earns its keep. On real logs the same check applies to battery sag:</w:t>
+      </w:r>
+      <w:r>
+        <w:t xml:space="preserve"> </w:t>
+      </w:r>
+      <w:r>
+        <w:t xml:space="preserve">a</w:t>
+      </w:r>
+      <w:r>
+        <w:t xml:space="preserve"> </w:t>
+      </w:r>
+      <w:r>
+        <w:t xml:space="preserve">“</w:t>
+      </w:r>
+      <w:r>
+        <w:t xml:space="preserve">sagged</w:t>
+      </w:r>
+      <w:r>
+        <w:t xml:space="preserve">”</w:t>
+      </w:r>
+      <w:r>
+        <w:t xml:space="preserve"> </w:t>
+      </w:r>
+      <w:r>
+        <w:t xml:space="preserve">pack lowers the true ceiling ~25 % (</w:t>
+      </w:r>
+      <w:r>
+        <w:rPr>
+          <w:rStyle w:val="VerbatimChar"/>
+        </w:rPr>
+        <w:t xml:space="preserve">docs/DESIGN.md</w:t>
+      </w:r>
+      <w:r>
+        <w:t xml:space="preserve"> </w:t>
+      </w:r>
+      <w:r>
+        <w:t xml:space="preserve">§9).</w:t>
+      </w:r>
+    </w:p>
+    <w:p>
+      <w:pPr>
+        <w:pStyle w:val="BodyText"/>
+      </w:pPr>
+      <w:r>
+        <w:rPr>
+          <w:bCs/>
+          <w:b/>
+        </w:rPr>
+        <w:t xml:space="preserve">5. Steady-state physics audit — do the numbers land where physics says?</w:t>
+      </w:r>
+      <w:r>
+        <w:t xml:space="preserve"> </w:t>
+      </w:r>
+      <w:r>
+        <w:t xml:space="preserve">After settling: thrust must equal weight — m·g = 0.033 × 9.81 =</w:t>
+      </w:r>
+      <w:r>
+        <w:t xml:space="preserve"> </w:t>
+      </w:r>
+      <w:r>
+        <w:rPr>
+          <w:bCs/>
+          <w:b/>
+        </w:rPr>
+        <w:t xml:space="preserve">0.324 N</w:t>
+      </w:r>
+      <w:r>
+        <w:t xml:space="preserve"> </w:t>
+      </w:r>
+      <w:r>
+        <w:t xml:space="preserve">— and the</w:t>
+      </w:r>
+      <w:r>
+        <w:t xml:space="preserve"> </w:t>
+      </w:r>
+      <w:r>
+        <w:t xml:space="preserve">hover demo’s thrust trace flattens exactly there. Body rates must go to zero. Error</w:t>
+      </w:r>
+      <w:r>
+        <w:t xml:space="preserve"> </w:t>
+      </w:r>
+      <w:r>
+        <w:t xml:space="preserve">must flatten at ~0 in simulation (</w:t>
+      </w:r>
+      <w:r>
+        <w:rPr>
+          <w:rStyle w:val="VerbatimChar"/>
+        </w:rPr>
+        <w:t xml:space="preserve">steady_rms_m: 0.00074</w:t>
+      </w:r>
+      <w:r>
+        <w:t xml:space="preserve">); in real flight a</w:t>
+      </w:r>
+      <w:r>
+        <w:t xml:space="preserve"> </w:t>
+      </w:r>
+      <w:r>
+        <w:rPr>
+          <w:bCs/>
+          <w:b/>
+        </w:rPr>
+        <w:t xml:space="preserve">constant</w:t>
+      </w:r>
+      <w:r>
+        <w:t xml:space="preserve"> </w:t>
+      </w:r>
+      <w:r>
+        <w:t xml:space="preserve">error offset is the estimator-bias fingerprint e_p = −(k_v/k_p)·b from</w:t>
+      </w:r>
+      <w:r>
+        <w:t xml:space="preserve"> </w:t>
+      </w:r>
+      <w:r>
+        <w:t xml:space="preserve">ch07 Experiment 1 — a 0.1 m/s velocity bias parks the vehicle 50 mm off target,</w:t>
+      </w:r>
+      <w:r>
+        <w:t xml:space="preserve"> </w:t>
+      </w:r>
+      <w:r>
+        <w:t xml:space="preserve">forever. Flat-but-not-zero is a</w:t>
+      </w:r>
+      <w:r>
+        <w:t xml:space="preserve"> </w:t>
+      </w:r>
+      <w:r>
+        <w:rPr>
+          <w:iCs/>
+          <w:i/>
+        </w:rPr>
+        <w:t xml:space="preserve">diagnosis</w:t>
+      </w:r>
+      <w:r>
+        <w:t xml:space="preserve">, not a mystery.</w:t>
+      </w:r>
+    </w:p>
+    <w:bookmarkEnd w:id="164"/>
+    <w:bookmarkStart w:id="165" w:name="the-same-panels-elsewhere"/>
+    <w:p>
+      <w:pPr>
+        <w:pStyle w:val="Heading2"/>
+      </w:pPr>
+      <w:r>
+        <w:t xml:space="preserve">The same panels, elsewhere</w:t>
+      </w:r>
+    </w:p>
+    <w:tbl>
+      <w:tblPr>
+        <w:tblStyle w:val="Table"/>
+        <w:tblW w:type="pct" w:w="5000.0"/>
+        <w:tblLook w:firstRow="1" w:lastRow="0" w:firstColumn="0" w:lastColumn="0" w:noHBand="0" w:noVBand="0" w:val="0020"/>
+      </w:tblPr>
+      <w:tblGrid>
+        <w:gridCol w:w="3960"/>
+        <w:gridCol w:w="3960"/>
+      </w:tblGrid>
+      <w:tr>
+        <w:tc>
+          <w:p>
+            <w:pPr>
+              <w:pStyle w:val="Compact"/>
+              <w:jc w:val="left"/>
+            </w:pPr>
+            <w:r>
+              <w:t xml:space="preserve">Where</w:t>
+            </w:r>
+          </w:p>
+        </w:tc>
+        <w:tc>
+          <w:p>
+            <w:pPr>
+              <w:pStyle w:val="Compact"/>
+              <w:jc w:val="left"/>
+            </w:pPr>
+            <w:r>
+              <w:t xml:space="preserve">What changes</w:t>
+            </w:r>
+          </w:p>
+        </w:tc>
+      </w:tr>
+      <w:tr>
+        <w:tc>
+          <w:p>
+            <w:pPr>
+              <w:pStyle w:val="Compact"/>
+              <w:jc w:val="left"/>
+            </w:pPr>
+            <w:r>
+              <w:rPr>
+                <w:rStyle w:val="VerbatimChar"/>
+              </w:rPr>
+              <w:t xml:space="preserve">demo_minsnap.py</w:t>
+            </w:r>
+            <w:r>
+              <w:t xml:space="preserve">,</w:t>
+            </w:r>
+            <w:r>
+              <w:t xml:space="preserve"> </w:t>
+            </w:r>
+            <w:r>
+              <w:rPr>
+                <w:rStyle w:val="VerbatimChar"/>
+              </w:rPr>
+              <w:t xml:space="preserve">demo_figure8.py</w:t>
+            </w:r>
+          </w:p>
+        </w:tc>
+        <w:tc>
+          <w:p>
+            <w:pPr>
+              <w:pStyle w:val="Compact"/>
+              <w:jc w:val="left"/>
+            </w:pPr>
+            <w:r>
+              <w:t xml:space="preserve">Reference is a moving curve, not a point; error stays nonzero</w:t>
+            </w:r>
+            <w:r>
+              <w:t xml:space="preserve"> </w:t>
+            </w:r>
+            <w:r>
+              <w:rPr>
+                <w:iCs/>
+                <w:i/>
+              </w:rPr>
+              <w:t xml:space="preserve">during</w:t>
+            </w:r>
+            <w:r>
+              <w:t xml:space="preserve"> </w:t>
+            </w:r>
+            <w:r>
+              <w:t xml:space="preserve">the maneuver (RMS targets: 0.08 m / 0.10 m), and check 4 matters most at the corners.</w:t>
+            </w:r>
+          </w:p>
+        </w:tc>
+      </w:tr>
+      <w:tr>
+        <w:tc>
+          <w:p>
+            <w:pPr>
+              <w:pStyle w:val="Compact"/>
+              <w:jc w:val="left"/>
+            </w:pPr>
+            <w:r>
+              <w:rPr>
+                <w:rStyle w:val="VerbatimChar"/>
+              </w:rPr>
+              <w:t xml:space="preserve">demo_swarm.py</w:t>
+            </w:r>
+            <w:r>
+              <w:t xml:space="preserve">,</w:t>
+            </w:r>
+            <w:r>
+              <w:t xml:space="preserve"> </w:t>
+            </w:r>
+            <w:r>
+              <w:rPr>
+                <w:rStyle w:val="VerbatimChar"/>
+              </w:rPr>
+              <w:t xml:space="preserve">demo_decentralized.py</w:t>
+            </w:r>
+          </w:p>
+        </w:tc>
+        <w:tc>
+          <w:p>
+            <w:pPr>
+              <w:pStyle w:val="Compact"/>
+              <w:jc w:val="left"/>
+            </w:pPr>
+            <w:r>
+              <w:t xml:space="preserve">One vehicle’s panels per quad plus formation metrics; add ch05/ch08’s min-pairwise-distance check to the list.</w:t>
+            </w:r>
+          </w:p>
+        </w:tc>
+      </w:tr>
+      <w:tr>
+        <w:tc>
+          <w:p>
+            <w:pPr>
+              <w:pStyle w:val="Compact"/>
+              <w:jc w:val="left"/>
+            </w:pPr>
+            <w:r>
+              <w:rPr>
+                <w:rStyle w:val="VerbatimChar"/>
+              </w:rPr>
+              <w:t xml:space="preserve">flight/analyze_log.py --plot</w:t>
+            </w:r>
+          </w:p>
+        </w:tc>
+        <w:tc>
+          <w:p>
+            <w:pPr>
+              <w:pStyle w:val="Compact"/>
+              <w:jc w:val="left"/>
+            </w:pPr>
+            <w:r>
+              <w:t xml:space="preserve">Same layout from a real log. Expect centimeters where sim shows millimeters (Flow-deck reality,</w:t>
+            </w:r>
+            <w:r>
+              <w:t xml:space="preserve"> </w:t>
+            </w:r>
+            <w:r>
+              <w:rPr>
+                <w:rStyle w:val="VerbatimChar"/>
+              </w:rPr>
+              <w:t xml:space="preserve">docs/ESTIMATION.md</w:t>
+            </w:r>
+            <w:r>
+              <w:t xml:space="preserve">), and run the five checks</w:t>
+            </w:r>
+            <w:r>
+              <w:t xml:space="preserve"> </w:t>
+            </w:r>
+            <w:r>
+              <w:rPr>
+                <w:iCs/>
+                <w:i/>
+              </w:rPr>
+              <w:t xml:space="preserve">in order</w:t>
+            </w:r>
+            <w:r>
+              <w:t xml:space="preserve"> </w:t>
+            </w:r>
+            <w:r>
+              <w:t xml:space="preserve">— they are the post-flight analysis the flight-test cards ask for.</w:t>
+            </w:r>
+          </w:p>
+        </w:tc>
+      </w:tr>
+    </w:tbl>
+    <w:p>
+      <w:pPr>
+        <w:pStyle w:val="BodyText"/>
+      </w:pPr>
+      <w:r>
+        <w:t xml:space="preserve">Five checks, one habit: reference vs actual, damping, settle time vs prediction,</w:t>
+      </w:r>
+      <w:r>
+        <w:t xml:space="preserve"> </w:t>
+      </w:r>
+      <w:r>
+        <w:t xml:space="preserve">saturation, physics audit. If all five pass, the flight was healthy; whichever one</w:t>
+      </w:r>
+      <w:r>
+        <w:t xml:space="preserve"> </w:t>
+      </w:r>
+      <w:r>
+        <w:t xml:space="preserve">fails names the chapter that explains it.</w:t>
+      </w:r>
+    </w:p>
+    <w:p>
+      <w:r>
+        <w:pict>
+          <v:rect style="width:0;height:1.5pt" o:hralign="center" o:hrstd="t" o:hr="t"/>
+        </w:pict>
+      </w:r>
+    </w:p>
+    <w:p>
+      <w:pPr>
+        <w:pStyle w:val="FirstParagraph"/>
+      </w:pPr>
+      <w:hyperlink r:id="rId131">
+        <w:r>
+          <w:rPr>
+            <w:rStyle w:val="Hyperlink"/>
+            <w:iCs/>
+            <w:i/>
+          </w:rPr>
+          <w:t xml:space="preserve">Course index</w:t>
+        </w:r>
+      </w:hyperlink>
+    </w:p>
+    <w:bookmarkEnd w:id="165"/>
+    <w:bookmarkEnd w:id="166"/>
     <w:sectPr/>
   </w:body>
 </w:document>

</xml_diff>